<commit_message>
Update the paper with the corrected DeepEval/Confident AI comparison
Checked docs directly for whether DeepEval or Confident AI has a
function to explain the detailed reason behind a score, the way this
project's report does — rather than let the earlier, slightly
overstated comparison stand. Both DeepEval (metric.reason) and this
project have per-case reasoning. Confident AI's hosted dashboard also
supports filtering test cases down from an aggregate, comparable to
the Claim IDs column — just gated behind a paid account rather than
built into the open-source library. What still has no documented
equivalent in either product, checked three separate times: a
standing explanation of what a metric MEANS, present regardless of
that run's numbers — the actual reason the Quality tab's What it
measures / How to read it columns were added.

States the correction plainly in the paper itself rather than quietly
replacing the earlier claim.

Co-Authored-By: Claude Sonnet 5 <noreply@anthropic.com>
</commit_message>
<xml_diff>
--- a/docs/Independent-Claim-Validator.docx
+++ b/docs/Independent-Claim-Validator.docx
@@ -6650,6 +6650,283 @@
           <w:szCs w:val="21"/>
         </w:rPr>
         <w:t xml:space="preserve"> DeepEval's own documentation describes no methodology for measuring its own metrics' run-to-run stability. census_repeated has reported an explicit range, with reproducible provenance, since before this comparison was made — more rigorous on that one specific axis than the dominant framework in this space, a fact this project only stated plainly once the comparison forced the question.</w:t>
+      </w:r>
+    </w:p>
+    <w:p>
+      <w:pPr>
+        <w:pStyle w:val="Heading2"/>
+        <w:spacing w:after="120" w:before="260"/>
+      </w:pPr>
+      <w:r>
+        <w:rPr>
+          <w:b/>
+          <w:bCs/>
+          <w:color w:val="2E2E2E"/>
+          <w:sz w:val="24"/>
+          <w:szCs w:val="24"/>
+        </w:rPr>
+        <w:t xml:space="preserve">Explaining a score, checked against what DeepEval actually documents</w:t>
+      </w:r>
+    </w:p>
+    <w:p>
+      <w:pPr>
+        <w:spacing w:after="140" w:line="300"/>
+      </w:pPr>
+      <w:r>
+        <w:rPr>
+          <w:sz w:val="21"/>
+          <w:szCs w:val="21"/>
+        </w:rPr>
+        <w:t xml:space="preserve">A direct question — does DeepEval or Confident AI have a function that explains the detailed reason behind a score, the way this project's report does — deserved checking against the documentation rather than assumed either way, since an earlier answer in this same investigation had understated what the paid platform actually offers.</w:t>
+      </w:r>
+    </w:p>
+    <w:tbl>
+      <w:tblPr>
+        <w:tblW w:type="dxa" w:w="9360"/>
+        <w:tblBorders>
+          <w:top w:val="single" w:color="auto" w:sz="4"/>
+          <w:left w:val="single" w:color="auto" w:sz="4"/>
+          <w:bottom w:val="single" w:color="auto" w:sz="4"/>
+          <w:right w:val="single" w:color="auto" w:sz="4"/>
+          <w:insideH w:val="single" w:color="auto" w:sz="4"/>
+          <w:insideV w:val="single" w:color="auto" w:sz="4"/>
+        </w:tblBorders>
+      </w:tblPr>
+      <w:tblGrid>
+        <w:gridCol w:w="2800"/>
+        <w:gridCol w:w="6560"/>
+      </w:tblGrid>
+      <w:tr>
+        <w:trPr>
+          <w:cantSplit/>
+          <w:tblHeader/>
+        </w:trPr>
+        <w:tc>
+          <w:tcPr>
+            <w:tcW w:type="dxa" w:w="2800"/>
+            <w:shd w:fill="1F4E79" w:val="clear"/>
+            <w:tcMar>
+              <w:top w:type="dxa" w:w="80"/>
+              <w:left w:type="dxa" w:w="110"/>
+              <w:bottom w:type="dxa" w:w="80"/>
+              <w:right w:type="dxa" w:w="110"/>
+            </w:tcMar>
+          </w:tcPr>
+          <w:p>
+            <w:pPr>
+              <w:spacing w:after="0" w:line="260"/>
+            </w:pPr>
+            <w:r>
+              <w:rPr>
+                <w:b/>
+                <w:bCs/>
+                <w:color w:val="FFFFFF"/>
+                <w:sz w:val="19"/>
+                <w:szCs w:val="19"/>
+              </w:rPr>
+              <w:t xml:space="preserve">Question</w:t>
+            </w:r>
+          </w:p>
+        </w:tc>
+        <w:tc>
+          <w:tcPr>
+            <w:tcW w:type="dxa" w:w="6560"/>
+            <w:shd w:fill="1F4E79" w:val="clear"/>
+            <w:tcMar>
+              <w:top w:type="dxa" w:w="80"/>
+              <w:left w:type="dxa" w:w="110"/>
+              <w:bottom w:type="dxa" w:w="80"/>
+              <w:right w:type="dxa" w:w="110"/>
+            </w:tcMar>
+          </w:tcPr>
+          <w:p>
+            <w:pPr>
+              <w:spacing w:after="0" w:line="260"/>
+            </w:pPr>
+            <w:r>
+              <w:rPr>
+                <w:b/>
+                <w:bCs/>
+                <w:color w:val="FFFFFF"/>
+                <w:sz w:val="19"/>
+                <w:szCs w:val="19"/>
+              </w:rPr>
+              <w:t xml:space="preserve">Answer, checked against the docs</w:t>
+            </w:r>
+          </w:p>
+        </w:tc>
+      </w:tr>
+      <w:tr>
+        <w:trPr>
+          <w:cantSplit/>
+        </w:trPr>
+        <w:tc>
+          <w:tcPr>
+            <w:tcW w:type="dxa" w:w="2800"/>
+            <w:tcMar>
+              <w:top w:type="dxa" w:w="80"/>
+              <w:left w:type="dxa" w:w="110"/>
+              <w:bottom w:type="dxa" w:w="80"/>
+              <w:right w:type="dxa" w:w="110"/>
+            </w:tcMar>
+          </w:tcPr>
+          <w:p>
+            <w:pPr>
+              <w:spacing w:after="0" w:line="260"/>
+            </w:pPr>
+            <w:r>
+              <w:rPr>
+                <w:sz w:val="19"/>
+                <w:szCs w:val="19"/>
+              </w:rPr>
+              <w:t xml:space="preserve">Does a metric explain why THIS score came out THIS way?</w:t>
+            </w:r>
+          </w:p>
+        </w:tc>
+        <w:tc>
+          <w:tcPr>
+            <w:tcW w:type="dxa" w:w="6560"/>
+            <w:tcMar>
+              <w:top w:type="dxa" w:w="80"/>
+              <w:left w:type="dxa" w:w="110"/>
+              <w:bottom w:type="dxa" w:w="80"/>
+              <w:right w:type="dxa" w:w="110"/>
+            </w:tcMar>
+          </w:tcPr>
+          <w:p>
+            <w:pPr>
+              <w:spacing w:after="0" w:line="260"/>
+            </w:pPr>
+            <w:r>
+              <w:rPr>
+                <w:sz w:val="19"/>
+                <w:szCs w:val="19"/>
+              </w:rPr>
+              <w:t xml:space="preserve">Yes, in both. DeepEval's metric.reason is an LLM-generated explanation of that specific score on that specific test case — directly comparable to this project's per-claim reason field, which quotes the judge's actual answer.</w:t>
+            </w:r>
+          </w:p>
+        </w:tc>
+      </w:tr>
+      <w:tr>
+        <w:trPr>
+          <w:cantSplit/>
+        </w:trPr>
+        <w:tc>
+          <w:tcPr>
+            <w:tcW w:type="dxa" w:w="2800"/>
+            <w:shd w:fill="F7F9FB" w:val="clear"/>
+            <w:tcMar>
+              <w:top w:type="dxa" w:w="80"/>
+              <w:left w:type="dxa" w:w="110"/>
+              <w:bottom w:type="dxa" w:w="80"/>
+              <w:right w:type="dxa" w:w="110"/>
+            </w:tcMar>
+          </w:tcPr>
+          <w:p>
+            <w:pPr>
+              <w:spacing w:after="0" w:line="260"/>
+            </w:pPr>
+            <w:r>
+              <w:rPr>
+                <w:sz w:val="19"/>
+                <w:szCs w:val="19"/>
+              </w:rPr>
+              <w:t xml:space="preserve">Can a reader trace which specific cases sit behind an aggregate number?</w:t>
+            </w:r>
+          </w:p>
+        </w:tc>
+        <w:tc>
+          <w:tcPr>
+            <w:tcW w:type="dxa" w:w="6560"/>
+            <w:shd w:fill="F7F9FB" w:val="clear"/>
+            <w:tcMar>
+              <w:top w:type="dxa" w:w="80"/>
+              <w:left w:type="dxa" w:w="110"/>
+              <w:bottom w:type="dxa" w:w="80"/>
+              <w:right w:type="dxa" w:w="110"/>
+            </w:tcMar>
+          </w:tcPr>
+          <w:p>
+            <w:pPr>
+              <w:spacing w:after="0" w:line="260"/>
+            </w:pPr>
+            <w:r>
+              <w:rPr>
+                <w:sz w:val="19"/>
+                <w:szCs w:val="19"/>
+              </w:rPr>
+              <w:t xml:space="preserve">Yes, in both — but only one of them requires a paid account. Confident AI's hosted dashboard lets a user filter and search individual test cases by score, reasoning and threshold, functionally comparable to the Claim IDs column, just a search interaction rather than a printed column beside the number. The capability exists only in Confident AI, not in the open-source deepeval library used standalone.</w:t>
+            </w:r>
+          </w:p>
+        </w:tc>
+      </w:tr>
+      <w:tr>
+        <w:trPr>
+          <w:cantSplit/>
+        </w:trPr>
+        <w:tc>
+          <w:tcPr>
+            <w:tcW w:type="dxa" w:w="2800"/>
+            <w:tcMar>
+              <w:top w:type="dxa" w:w="80"/>
+              <w:left w:type="dxa" w:w="110"/>
+              <w:bottom w:type="dxa" w:w="80"/>
+              <w:right w:type="dxa" w:w="110"/>
+            </w:tcMar>
+          </w:tcPr>
+          <w:p>
+            <w:pPr>
+              <w:spacing w:after="0" w:line="260"/>
+            </w:pPr>
+            <w:r>
+              <w:rPr>
+                <w:sz w:val="19"/>
+                <w:szCs w:val="19"/>
+              </w:rPr>
+              <w:t xml:space="preserve">Is there a standing explanation of what a metric MEANS, independent of any one run's numbers?</w:t>
+            </w:r>
+          </w:p>
+        </w:tc>
+        <w:tc>
+          <w:tcPr>
+            <w:tcW w:type="dxa" w:w="6560"/>
+            <w:tcMar>
+              <w:top w:type="dxa" w:w="80"/>
+              <w:left w:type="dxa" w:w="110"/>
+              <w:bottom w:type="dxa" w:w="80"/>
+              <w:right w:type="dxa" w:w="110"/>
+            </w:tcMar>
+          </w:tcPr>
+          <w:p>
+            <w:pPr>
+              <w:spacing w:after="0" w:line="260"/>
+            </w:pPr>
+            <w:r>
+              <w:rPr>
+                <w:sz w:val="19"/>
+                <w:szCs w:val="19"/>
+              </w:rPr>
+              <w:t xml:space="preserve">Not found in DeepEval's metric docs, G-Eval's own docs, or the Confident AI dashboard description — checked directly, three separate times, not assumed. metric.reason explains this score, this time; it is generated fresh per test case, not a fixed "what it measures / how to read it" that stays on the page whether the run's numbers look good or alarming.</w:t>
+            </w:r>
+          </w:p>
+        </w:tc>
+      </w:tr>
+    </w:tbl>
+    <w:p>
+      <w:pPr>
+        <w:spacing w:after="160"/>
+      </w:pPr>
+    </w:p>
+    <w:p>
+      <w:pPr>
+        <w:spacing w:after="140" w:line="300"/>
+      </w:pPr>
+      <w:r>
+        <w:rPr>
+          <w:sz w:val="21"/>
+          <w:szCs w:val="21"/>
+        </w:rPr>
+        <w:t xml:space="preserve">The corrected version, stated plainly: per-case reasoning and aggregate-to-case traceability are both real capabilities DeepEval and Confident AI offer, not gaps — an earlier pass at this comparison implied more of an edge here than the evidence actually supports, and the fix was to check the docs again rather than let the first answer stand. What still has no documented equivalent in either product is the standing, always-present explanation of a metric's own meaning — the specific thing that made the Quality tab's What it measures / How to read it columns worth adding in the first place, and the same discipline behind the Shape checks and Gaps tabs carrying a reason on every row, pass or fail, rather than only on the failures a search would surface.</w:t>
       </w:r>
     </w:p>
     <w:p>

</xml_diff>